<commit_message>
Add Week 6 memory retention job, human memory controls and docs
</commit_message>
<xml_diff>
--- a/docs/requirements/week1/quality-and-security-documentation.docx
+++ b/docs/requirements/week1/quality-and-security-documentation.docx
@@ -3516,6 +3516,12 @@
           <w:color w:val="000000"/>
         </w:rPr>
         <w:t xml:space="preserve">How long the memory record (proposed, run, and rejected tests per module) is retained before it’s cleared.</w:t>
+      </w:r>
+      <w:r>
+        <w:rPr>
+          <w:rFonts w:ascii="Times New Roman" w:hAnsi="Times New Roman"/>
+        </w:rPr>
+        <w:t xml:space="preserve"> Resolved in Week 6: by team vote, records are kept until a human clears them (charter Scope item (v); src/memory/retention.py).</w:t>
       </w:r>
     </w:p>
     <w:bookmarkEnd w:id="24"/>
@@ -5527,6 +5533,141 @@
                 <w:color w:val="000000"/>
               </w:rPr>
               <w:t xml:space="preserve">US-6</w:t>
+            </w:r>
+          </w:p>
+        </w:tc>
+      </w:tr>
+      <w:tr>
+        <w:tc>
+          <w:tcPr>
+            <w:tcW w:type="dxa" w:w="500"/>
+            <w:vAlign w:val="center"/>
+          </w:tcPr>
+          <w:p>
+            <w:pPr>
+              <w:pStyle w:val="Compact"/>
+              <w:jc w:val="center"/>
+            </w:pPr>
+            <w:r>
+              <w:rPr>
+                <w:rFonts w:ascii="Times New Roman" w:hAnsi="Times New Roman" w:eastAsia="Times New Roman" w:cs="Times New Roman"/>
+                <w:color w:val="000000"/>
+              </w:rPr>
+              <w:t>R14</w:t>
+            </w:r>
+          </w:p>
+        </w:tc>
+        <w:tc>
+          <w:tcPr>
+            <w:tcW w:type="dxa" w:w="1000"/>
+            <w:vAlign w:val="center"/>
+          </w:tcPr>
+          <w:p>
+            <w:pPr>
+              <w:pStyle w:val="Compact"/>
+              <w:jc w:val="center"/>
+            </w:pPr>
+            <w:r>
+              <w:rPr>
+                <w:rFonts w:ascii="Times New Roman" w:hAnsi="Times New Roman" w:eastAsia="Times New Roman" w:cs="Times New Roman"/>
+                <w:color w:val="000000"/>
+              </w:rPr>
+              <w:t>Memory silently influencing a critical decision</w:t>
+            </w:r>
+          </w:p>
+        </w:tc>
+        <w:tc>
+          <w:tcPr>
+            <w:tcW w:type="dxa" w:w="2200"/>
+            <w:vAlign w:val="center"/>
+          </w:tcPr>
+          <w:p>
+            <w:pPr>
+              <w:pStyle w:val="Compact"/>
+              <w:jc w:val="center"/>
+            </w:pPr>
+            <w:r>
+              <w:rPr>
+                <w:rFonts w:ascii="Times New Roman" w:hAnsi="Times New Roman" w:eastAsia="Times New Roman" w:cs="Times New Roman"/>
+                <w:color w:val="000000"/>
+              </w:rPr>
+              <w:t>A stored memory record, for example a run or rejected proposal, is treated as approval to run a test, or quietly stops a valid test from being proposed, without a human seeing why.</w:t>
+            </w:r>
+          </w:p>
+        </w:tc>
+        <w:tc>
+          <w:tcPr>
+            <w:tcW w:type="dxa" w:w="700"/>
+            <w:vAlign w:val="center"/>
+          </w:tcPr>
+          <w:p>
+            <w:pPr>
+              <w:pStyle w:val="Compact"/>
+              <w:jc w:val="center"/>
+            </w:pPr>
+            <w:r>
+              <w:rPr>
+                <w:rFonts w:ascii="Times New Roman" w:hAnsi="Times New Roman" w:eastAsia="Times New Roman" w:cs="Times New Roman"/>
+                <w:color w:val="000000"/>
+              </w:rPr>
+              <w:t>Low</w:t>
+            </w:r>
+          </w:p>
+        </w:tc>
+        <w:tc>
+          <w:tcPr>
+            <w:tcW w:type="dxa" w:w="700"/>
+            <w:vAlign w:val="center"/>
+          </w:tcPr>
+          <w:p>
+            <w:pPr>
+              <w:pStyle w:val="Compact"/>
+              <w:jc w:val="center"/>
+            </w:pPr>
+            <w:r>
+              <w:rPr>
+                <w:rFonts w:ascii="Times New Roman" w:hAnsi="Times New Roman" w:eastAsia="Times New Roman" w:cs="Times New Roman"/>
+                <w:color w:val="000000"/>
+              </w:rPr>
+              <w:t>High</w:t>
+            </w:r>
+          </w:p>
+        </w:tc>
+        <w:tc>
+          <w:tcPr>
+            <w:tcW w:type="dxa" w:w="3000"/>
+            <w:vAlign w:val="center"/>
+          </w:tcPr>
+          <w:p>
+            <w:pPr>
+              <w:pStyle w:val="Compact"/>
+              <w:jc w:val="center"/>
+            </w:pPr>
+            <w:r>
+              <w:rPr>
+                <w:rFonts w:ascii="Times New Roman" w:hAnsi="Times New Roman" w:eastAsia="Times New Roman" w:cs="Times New Roman"/>
+                <w:color w:val="000000"/>
+              </w:rPr>
+              <w:t>Memory is advisory context only: the record has no approved status, the approval gate takes no memory input, and src/agent and src/tools cannot import the rejection or clear functions, enforced by tests/test_memory_guard.py, tests/test_memory_api.py and tests/test_memory_retention.py. Rejecting and clearing memory are human-only commands that require a role handle and write an audit line, and the prompt presents memory as context to read, not instructions.</w:t>
+            </w:r>
+          </w:p>
+        </w:tc>
+        <w:tc>
+          <w:tcPr>
+            <w:tcW w:type="dxa" w:w="900"/>
+            <w:vAlign w:val="center"/>
+          </w:tcPr>
+          <w:p>
+            <w:pPr>
+              <w:pStyle w:val="Compact"/>
+              <w:jc w:val="center"/>
+            </w:pPr>
+            <w:r>
+              <w:rPr>
+                <w:rFonts w:ascii="Times New Roman" w:hAnsi="Times New Roman" w:eastAsia="Times New Roman" w:cs="Times New Roman"/>
+                <w:color w:val="000000"/>
+              </w:rPr>
+              <w:t>US-3, US-10; charter Scope item (v)</w:t>
             </w:r>
           </w:p>
         </w:tc>

</xml_diff>